<commit_message>
Hide the unfinished footer links instead of pointing them at nothing
</commit_message>
<xml_diff>
--- a/docs/ReturnNRefundPolicy.docx
+++ b/docs/ReturnNRefundPolicy.docx
@@ -1,6 +1,6 @@
 
 <file path=word/document.xml><?xml version="1.0" encoding="utf-8"?>
-<w:document xmlns:wpc="http://schemas.microsoft.com/office/word/2010/wordprocessingCanvas" xmlns:cx="http://schemas.microsoft.com/office/drawing/2014/chartex" xmlns:cx1="http://schemas.microsoft.com/office/drawing/2015/9/8/chartex" xmlns:cx2="http://schemas.microsoft.com/office/drawing/2015/10/21/chartex" xmlns:cx3="http://schemas.microsoft.com/office/drawing/2016/5/9/chartex" xmlns:cx4="http://schemas.microsoft.com/office/drawing/2016/5/10/chartex" xmlns:cx5="http://schemas.microsoft.com/office/drawing/2016/5/11/chartex" xmlns:cx6="http://schemas.microsoft.com/office/drawing/2016/5/12/chartex" xmlns:cx7="http://schemas.microsoft.com/office/drawing/2016/5/13/chartex" xmlns:cx8="http://schemas.microsoft.com/office/drawing/2016/5/14/chartex" xmlns:mc="http://schemas.openxmlformats.org/markup-compatibility/2006" xmlns:aink="http://schemas.microsoft.com/office/drawing/2016/ink" xmlns:am3d="http://schemas.microsoft.com/office/drawing/2017/model3d" xmlns:o="urn:schemas-microsoft-com:office:office" xmlns:oel="http://schemas.microsoft.com/office/2019/extlst" xmlns:r="http://schemas.openxmlformats.org/officeDocument/2006/relationships" xmlns:m="http://schemas.openxmlformats.org/officeDocument/2006/math" xmlns:v="urn:schemas-microsoft-com:vml" xmlns:wp14="http://schemas.microsoft.com/office/word/2010/wordprocessingDrawing" xmlns:wp="http://schemas.openxmlformats.org/drawingml/2006/wordprocessingDrawing" xmlns:w10="urn:schemas-microsoft-com:office:word" xmlns:w="http://schemas.openxmlformats.org/wordprocessingml/2006/main" xmlns:w14="http://schemas.microsoft.com/office/word/2010/wordml" xmlns:w15="http://schemas.microsoft.com/office/word/2012/wordml" xmlns:w16cei="http://schemas.microsoft.com/office/word/2026/wordml/cei" xmlns:w16cex="http://schemas.microsoft.com/office/word/2018/wordml/cex" xmlns:w16cid="http://schemas.microsoft.com/office/word/2016/wordml/cid" xmlns:w16="http://schemas.microsoft.com/office/word/2018/wordml" xmlns:w16du="http://schemas.microsoft.com/office/word/2023/wordml/word16du" xmlns:w16sdtdh="http://schemas.microsoft.com/office/word/2020/wordml/sdtdatahash" xmlns:w16sdtfl="http://schemas.microsoft.com/office/word/2024/wordml/sdtformatlock" xmlns:w16se="http://schemas.microsoft.com/office/word/2015/wordml/symex" xmlns:wpg="http://schemas.microsoft.com/office/word/2010/wordprocessingGroup" xmlns:wpi="http://schemas.microsoft.com/office/word/2010/wordprocessingInk" xmlns:wne="http://schemas.microsoft.com/office/word/2006/wordml" xmlns:wps="http://schemas.microsoft.com/office/word/2010/wordprocessingShape" mc:Ignorable="w14 w15 w16se w16cid w16 w16cex w16sdtdh w16sdtfl w16du wp14">
+<w:document xmlns:wpc="http://schemas.microsoft.com/office/word/2010/wordprocessingCanvas" xmlns:cx="http://schemas.microsoft.com/office/drawing/2014/chartex" xmlns:cx1="http://schemas.microsoft.com/office/drawing/2015/9/8/chartex" xmlns:cx2="http://schemas.microsoft.com/office/drawing/2015/10/21/chartex" xmlns:cx3="http://schemas.microsoft.com/office/drawing/2016/5/9/chartex" xmlns:cx4="http://schemas.microsoft.com/office/drawing/2016/5/10/chartex" xmlns:cx5="http://schemas.microsoft.com/office/drawing/2016/5/11/chartex" xmlns:cx6="http://schemas.microsoft.com/office/drawing/2016/5/12/chartex" xmlns:cx7="http://schemas.microsoft.com/office/drawing/2016/5/13/chartex" xmlns:cx8="http://schemas.microsoft.com/office/drawing/2016/5/14/chartex" xmlns:mc="http://schemas.openxmlformats.org/markup-compatibility/2006" xmlns:aink="http://schemas.microsoft.com/office/drawing/2016/ink" xmlns:am3d="http://schemas.microsoft.com/office/drawing/2017/model3d" xmlns:o="urn:schemas-microsoft-com:office:office" xmlns:oel="http://schemas.microsoft.com/office/2019/extlst" xmlns:r="http://schemas.openxmlformats.org/officeDocument/2006/relationships" xmlns:m="http://schemas.openxmlformats.org/officeDocument/2006/math" xmlns:v="urn:schemas-microsoft-com:vml" xmlns:wp14="http://schemas.microsoft.com/office/word/2010/wordprocessingDrawing" xmlns:wp="http://schemas.openxmlformats.org/drawingml/2006/wordprocessingDrawing" xmlns:w10="urn:schemas-microsoft-com:office:word" xmlns:w="http://schemas.openxmlformats.org/wordprocessingml/2006/main" xmlns:w14="http://schemas.microsoft.com/office/word/2010/wordml" xmlns:w15="http://schemas.microsoft.com/office/word/2012/wordml" xmlns:w16cex="http://schemas.microsoft.com/office/word/2018/wordml/cex" xmlns:w16cid="http://schemas.microsoft.com/office/word/2016/wordml/cid" xmlns:w16="http://schemas.microsoft.com/office/word/2018/wordml" xmlns:w16du="http://schemas.microsoft.com/office/word/2023/wordml/word16du" xmlns:w16sdtdh="http://schemas.microsoft.com/office/word/2020/wordml/sdtdatahash" xmlns:w16sdtfl="http://schemas.microsoft.com/office/word/2024/wordml/sdtformatlock" xmlns:w16se="http://schemas.microsoft.com/office/word/2015/wordml/symex" xmlns:wpg="http://schemas.microsoft.com/office/word/2010/wordprocessingGroup" xmlns:wpi="http://schemas.microsoft.com/office/word/2010/wordprocessingInk" xmlns:wne="http://schemas.microsoft.com/office/word/2006/wordml" xmlns:wps="http://schemas.microsoft.com/office/word/2010/wordprocessingShape" mc:Ignorable="w14 w15 w16se w16cid w16 w16cex w16sdtdh w16sdtfl w16du wp14">
   <w:body>
     <w:p>
       <w:pPr>
@@ -8,7 +8,7 @@
           <w:tab w:val="left" w:pos="2400"/>
         </w:tabs>
         <w:rPr>
-          <w:rFonts w:ascii="Prompt" w:hAnsi="Prompt" w:cs="Prompt" w:hint="cs"/>
+          <w:rFonts w:ascii="Prompt" w:hAnsi="Prompt" w:cs="Prompt"/>
           <w:b/>
           <w:bCs/>
           <w:sz w:val="20"/>
@@ -57,7 +57,7 @@
           <w:tab w:val="left" w:pos="2400"/>
         </w:tabs>
         <w:rPr>
-          <w:rFonts w:ascii="Prompt" w:hAnsi="Prompt" w:cs="Prompt" w:hint="cs"/>
+          <w:rFonts w:ascii="Prompt" w:hAnsi="Prompt" w:cs="Prompt"/>
           <w:sz w:val="20"/>
           <w:szCs w:val="20"/>
         </w:rPr>
@@ -312,7 +312,7 @@
           <w:tab w:val="left" w:pos="2400"/>
         </w:tabs>
         <w:rPr>
-          <w:rFonts w:ascii="Prompt" w:hAnsi="Prompt" w:cs="Prompt" w:hint="cs"/>
+          <w:rFonts w:ascii="Prompt" w:hAnsi="Prompt" w:cs="Prompt"/>
           <w:sz w:val="20"/>
           <w:szCs w:val="20"/>
         </w:rPr>
@@ -329,7 +329,7 @@
           <w:tab w:val="left" w:pos="2400"/>
         </w:tabs>
         <w:rPr>
-          <w:rFonts w:ascii="Prompt" w:hAnsi="Prompt" w:cs="Prompt" w:hint="cs"/>
+          <w:rFonts w:ascii="Prompt" w:hAnsi="Prompt" w:cs="Prompt"/>
           <w:sz w:val="20"/>
           <w:szCs w:val="20"/>
         </w:rPr>
@@ -378,7 +378,7 @@
           <w:tab w:val="left" w:pos="2400"/>
         </w:tabs>
         <w:rPr>
-          <w:rFonts w:ascii="Prompt" w:hAnsi="Prompt" w:cs="Prompt" w:hint="cs"/>
+          <w:rFonts w:ascii="Prompt" w:hAnsi="Prompt" w:cs="Prompt"/>
           <w:sz w:val="20"/>
           <w:szCs w:val="20"/>
         </w:rPr>
@@ -433,13 +433,55 @@
         <w:shd w:val="clear" w:color="auto" w:fill="FFFFFF"/>
         <w:spacing w:before="100" w:beforeAutospacing="1" w:after="100" w:afterAutospacing="1" w:line="240" w:lineRule="auto"/>
         <w:rPr>
+          <w:rFonts w:ascii="Prompt" w:eastAsia="Times New Roman" w:hAnsi="Prompt" w:cs="Prompt"/>
+          <w:kern w:val="0"/>
+          <w:sz w:val="20"/>
+          <w:szCs w:val="20"/>
+          <w14:ligatures w14:val="none"/>
+        </w:rPr>
+      </w:pPr>
+      <w:r>
+        <w:rPr>
           <w:rFonts w:ascii="Prompt" w:eastAsia="Times New Roman" w:hAnsi="Prompt" w:cs="Prompt" w:hint="cs"/>
           <w:kern w:val="0"/>
           <w:sz w:val="20"/>
           <w:szCs w:val="20"/>
           <w14:ligatures w14:val="none"/>
         </w:rPr>
-      </w:pPr>
+        <w:t xml:space="preserve">If a problem is found with the product itself or due to installation carried out by </w:t>
+      </w:r>
+      <w:proofErr w:type="spellStart"/>
+      <w:r>
+        <w:rPr>
+          <w:rFonts w:ascii="Prompt" w:eastAsia="Times New Roman" w:hAnsi="Prompt" w:cs="Prompt"/>
+          <w:kern w:val="0"/>
+          <w:sz w:val="20"/>
+          <w:szCs w:val="20"/>
+          <w14:ligatures w14:val="none"/>
+        </w:rPr>
+        <w:t>Find</w:t>
+      </w:r>
+      <w:r>
+        <w:rPr>
+          <w:rFonts w:ascii="Prompt" w:eastAsia="Times New Roman" w:hAnsi="Prompt" w:cs="Prompt"/>
+          <w:kern w:val="0"/>
+          <w:sz w:val="20"/>
+          <w:szCs w:val="20"/>
+          <w14:ligatures w14:val="none"/>
+        </w:rPr>
+        <w:t>m</w:t>
+      </w:r>
+      <w:r>
+        <w:rPr>
+          <w:rFonts w:ascii="Prompt" w:eastAsia="Times New Roman" w:hAnsi="Prompt" w:cs="Prompt"/>
+          <w:kern w:val="0"/>
+          <w:sz w:val="20"/>
+          <w:szCs w:val="20"/>
+          <w14:ligatures w14:val="none"/>
+        </w:rPr>
+        <w:t>yRobo</w:t>
+      </w:r>
+      <w:proofErr w:type="spellEnd"/>
       <w:r>
         <w:rPr>
           <w:rFonts w:ascii="Prompt" w:eastAsia="Times New Roman" w:hAnsi="Prompt" w:cs="Prompt" w:hint="cs"/>
@@ -448,9 +490,30 @@
           <w:szCs w:val="20"/>
           <w14:ligatures w14:val="none"/>
         </w:rPr>
-        <w:t xml:space="preserve">If a problem is found with the product itself or due to installation carried out by </w:t>
-      </w:r>
-      <w:proofErr w:type="spellStart"/>
+        <w:t xml:space="preserve">, customers </w:t>
+      </w:r>
+      <w:proofErr w:type="gramStart"/>
+      <w:r>
+        <w:rPr>
+          <w:rFonts w:ascii="Prompt" w:eastAsia="Times New Roman" w:hAnsi="Prompt" w:cs="Prompt" w:hint="cs"/>
+          <w:kern w:val="0"/>
+          <w:sz w:val="20"/>
+          <w:szCs w:val="20"/>
+          <w14:ligatures w14:val="none"/>
+        </w:rPr>
+        <w:t>are able to</w:t>
+      </w:r>
+      <w:proofErr w:type="gramEnd"/>
+      <w:r>
+        <w:rPr>
+          <w:rFonts w:ascii="Prompt" w:eastAsia="Times New Roman" w:hAnsi="Prompt" w:cs="Prompt" w:hint="cs"/>
+          <w:kern w:val="0"/>
+          <w:sz w:val="20"/>
+          <w:szCs w:val="20"/>
+          <w14:ligatures w14:val="none"/>
+        </w:rPr>
+        <w:t xml:space="preserve"> notify the return </w:t>
+      </w:r>
       <w:r>
         <w:rPr>
           <w:rFonts w:ascii="Prompt" w:eastAsia="Times New Roman" w:hAnsi="Prompt" w:cs="Prompt"/>
@@ -459,9 +522,8 @@
           <w:szCs w:val="20"/>
           <w14:ligatures w14:val="none"/>
         </w:rPr>
-        <w:t>FindMyRobo</w:t>
-      </w:r>
-      <w:proofErr w:type="spellEnd"/>
+        <w:t xml:space="preserve">of </w:t>
+      </w:r>
       <w:r>
         <w:rPr>
           <w:rFonts w:ascii="Prompt" w:eastAsia="Times New Roman" w:hAnsi="Prompt" w:cs="Prompt" w:hint="cs"/>
@@ -470,9 +532,40 @@
           <w:szCs w:val="20"/>
           <w14:ligatures w14:val="none"/>
         </w:rPr>
-        <w:t xml:space="preserve">, customers </w:t>
-      </w:r>
-      <w:proofErr w:type="gramStart"/>
+        <w:t xml:space="preserve">the product. However, all cases require prior approval from </w:t>
+      </w:r>
+      <w:proofErr w:type="spellStart"/>
+      <w:r>
+        <w:rPr>
+          <w:rFonts w:ascii="Prompt" w:eastAsia="Times New Roman" w:hAnsi="Prompt" w:cs="Prompt"/>
+          <w:kern w:val="0"/>
+          <w:sz w:val="20"/>
+          <w:szCs w:val="20"/>
+          <w14:ligatures w14:val="none"/>
+        </w:rPr>
+        <w:t>Find</w:t>
+      </w:r>
+      <w:r>
+        <w:rPr>
+          <w:rFonts w:ascii="Prompt" w:eastAsia="Times New Roman" w:hAnsi="Prompt" w:cs="Prompt"/>
+          <w:kern w:val="0"/>
+          <w:sz w:val="20"/>
+          <w:szCs w:val="20"/>
+          <w14:ligatures w14:val="none"/>
+        </w:rPr>
+        <w:t>m</w:t>
+      </w:r>
+      <w:r>
+        <w:rPr>
+          <w:rFonts w:ascii="Prompt" w:eastAsia="Times New Roman" w:hAnsi="Prompt" w:cs="Prompt"/>
+          <w:kern w:val="0"/>
+          <w:sz w:val="20"/>
+          <w:szCs w:val="20"/>
+          <w14:ligatures w14:val="none"/>
+        </w:rPr>
+        <w:t>yRobo</w:t>
+      </w:r>
+      <w:proofErr w:type="spellEnd"/>
       <w:r>
         <w:rPr>
           <w:rFonts w:ascii="Prompt" w:eastAsia="Times New Roman" w:hAnsi="Prompt" w:cs="Prompt" w:hint="cs"/>
@@ -481,19 +574,9 @@
           <w:szCs w:val="20"/>
           <w14:ligatures w14:val="none"/>
         </w:rPr>
-        <w:t>are able to</w:t>
-      </w:r>
-      <w:proofErr w:type="gramEnd"/>
-      <w:r>
-        <w:rPr>
-          <w:rFonts w:ascii="Prompt" w:eastAsia="Times New Roman" w:hAnsi="Prompt" w:cs="Prompt" w:hint="cs"/>
-          <w:kern w:val="0"/>
-          <w:sz w:val="20"/>
-          <w:szCs w:val="20"/>
-          <w14:ligatures w14:val="none"/>
-        </w:rPr>
-        <w:t xml:space="preserve"> notify the return </w:t>
-      </w:r>
+        <w:t xml:space="preserve">, and </w:t>
+      </w:r>
+      <w:proofErr w:type="spellStart"/>
       <w:r>
         <w:rPr>
           <w:rFonts w:ascii="Prompt" w:eastAsia="Times New Roman" w:hAnsi="Prompt" w:cs="Prompt"/>
@@ -502,19 +585,8 @@
           <w:szCs w:val="20"/>
           <w14:ligatures w14:val="none"/>
         </w:rPr>
-        <w:t xml:space="preserve">of </w:t>
-      </w:r>
-      <w:r>
-        <w:rPr>
-          <w:rFonts w:ascii="Prompt" w:eastAsia="Times New Roman" w:hAnsi="Prompt" w:cs="Prompt" w:hint="cs"/>
-          <w:kern w:val="0"/>
-          <w:sz w:val="20"/>
-          <w:szCs w:val="20"/>
-          <w14:ligatures w14:val="none"/>
-        </w:rPr>
-        <w:t xml:space="preserve">the product. However, all cases require prior approval from </w:t>
-      </w:r>
-      <w:proofErr w:type="spellStart"/>
+        <w:t>Find</w:t>
+      </w:r>
       <w:r>
         <w:rPr>
           <w:rFonts w:ascii="Prompt" w:eastAsia="Times New Roman" w:hAnsi="Prompt" w:cs="Prompt"/>
@@ -523,20 +595,8 @@
           <w:szCs w:val="20"/>
           <w14:ligatures w14:val="none"/>
         </w:rPr>
-        <w:t>FindMyRobo</w:t>
-      </w:r>
-      <w:proofErr w:type="spellEnd"/>
-      <w:r>
-        <w:rPr>
-          <w:rFonts w:ascii="Prompt" w:eastAsia="Times New Roman" w:hAnsi="Prompt" w:cs="Prompt" w:hint="cs"/>
-          <w:kern w:val="0"/>
-          <w:sz w:val="20"/>
-          <w:szCs w:val="20"/>
-          <w14:ligatures w14:val="none"/>
-        </w:rPr>
-        <w:t xml:space="preserve">, and </w:t>
-      </w:r>
-      <w:proofErr w:type="spellStart"/>
+        <w:t>m</w:t>
+      </w:r>
       <w:r>
         <w:rPr>
           <w:rFonts w:ascii="Prompt" w:eastAsia="Times New Roman" w:hAnsi="Prompt" w:cs="Prompt"/>
@@ -545,7 +605,7 @@
           <w:szCs w:val="20"/>
           <w14:ligatures w14:val="none"/>
         </w:rPr>
-        <w:t>FindMyRobo</w:t>
+        <w:t>yRobo</w:t>
       </w:r>
       <w:r>
         <w:rPr>
@@ -597,9 +657,8 @@
           <w14:ligatures w14:val="none"/>
         </w:rPr>
         <w:lastRenderedPageBreak/>
-        <w:t>FindMyRobo</w:t>
-      </w:r>
-      <w:proofErr w:type="spellEnd"/>
+        <w:t>Find</w:t>
+      </w:r>
       <w:r>
         <w:rPr>
           <w:rFonts w:ascii="Prompt" w:eastAsia="Times New Roman" w:hAnsi="Prompt" w:cs="Prompt"/>
@@ -609,9 +668,8 @@
           <w:szCs w:val="21"/>
           <w14:ligatures w14:val="none"/>
         </w:rPr>
-        <w:t xml:space="preserve"> </w:t>
-      </w:r>
-      <w:proofErr w:type="gramStart"/>
+        <w:t>m</w:t>
+      </w:r>
       <w:r>
         <w:rPr>
           <w:rFonts w:ascii="Prompt" w:eastAsia="Times New Roman" w:hAnsi="Prompt" w:cs="Prompt"/>
@@ -621,9 +679,9 @@
           <w:szCs w:val="21"/>
           <w14:ligatures w14:val="none"/>
         </w:rPr>
-        <w:t>shall</w:t>
-      </w:r>
-      <w:proofErr w:type="gramEnd"/>
+        <w:t>yRobo</w:t>
+      </w:r>
+      <w:proofErr w:type="spellEnd"/>
       <w:r>
         <w:rPr>
           <w:rFonts w:ascii="Prompt" w:eastAsia="Times New Roman" w:hAnsi="Prompt" w:cs="Prompt"/>
@@ -633,7 +691,7 @@
           <w:szCs w:val="21"/>
           <w14:ligatures w14:val="none"/>
         </w:rPr>
-        <w:t xml:space="preserve"> contact to inform the result of inspection, if it does not </w:t>
+        <w:t xml:space="preserve"> shall contact to inform the result of inspection, if it does not contrary with the condition and the new product is available, the preferable channel to </w:t>
       </w:r>
       <w:proofErr w:type="gramStart"/>
       <w:r>
@@ -645,9 +703,8 @@
           <w:szCs w:val="21"/>
           <w14:ligatures w14:val="none"/>
         </w:rPr>
-        <w:t>contrary with</w:t>
-      </w:r>
-      <w:proofErr w:type="gramEnd"/>
+        <w:t>change-</w:t>
+      </w:r>
       <w:r>
         <w:rPr>
           <w:rFonts w:ascii="Prompt" w:eastAsia="Times New Roman" w:hAnsi="Prompt" w:cs="Prompt"/>
@@ -657,8 +714,9 @@
           <w:szCs w:val="21"/>
           <w14:ligatures w14:val="none"/>
         </w:rPr>
-        <w:t xml:space="preserve"> the condition and the new product is available, the preferable channel to </w:t>
-      </w:r>
+        <w:t>return</w:t>
+      </w:r>
+      <w:proofErr w:type="gramEnd"/>
       <w:r>
         <w:rPr>
           <w:rFonts w:ascii="Prompt" w:eastAsia="Times New Roman" w:hAnsi="Prompt" w:cs="Prompt"/>
@@ -668,7 +726,7 @@
           <w:szCs w:val="21"/>
           <w14:ligatures w14:val="none"/>
         </w:rPr>
-        <w:t>change-</w:t>
+        <w:t xml:space="preserve"> for the customer shall be inquired and make an appointment to deliver the product</w:t>
       </w:r>
       <w:r>
         <w:rPr>
@@ -679,7 +737,7 @@
           <w:szCs w:val="21"/>
           <w14:ligatures w14:val="none"/>
         </w:rPr>
-        <w:t>return for the customer shall be inquired and make an appointment to deliver the product</w:t>
+        <w:t xml:space="preserve"> or do the process of the refund.</w:t>
       </w:r>
       <w:r>
         <w:rPr>
@@ -690,17 +748,6 @@
           <w:szCs w:val="21"/>
           <w14:ligatures w14:val="none"/>
         </w:rPr>
-        <w:t xml:space="preserve"> or do the process of the refund.</w:t>
-      </w:r>
-      <w:r>
-        <w:rPr>
-          <w:rFonts w:ascii="Prompt" w:eastAsia="Times New Roman" w:hAnsi="Prompt" w:cs="Prompt"/>
-          <w:color w:val="525255"/>
-          <w:kern w:val="0"/>
-          <w:sz w:val="21"/>
-          <w:szCs w:val="21"/>
-          <w14:ligatures w14:val="none"/>
-        </w:rPr>
         <w:br/>
       </w:r>
     </w:p>
@@ -766,7 +813,7 @@
           <w:tab w:val="left" w:pos="2400"/>
         </w:tabs>
         <w:rPr>
-          <w:rFonts w:ascii="Prompt" w:hAnsi="Prompt" w:cs="Prompt" w:hint="cs"/>
+          <w:rFonts w:ascii="Prompt" w:hAnsi="Prompt" w:cs="Prompt"/>
           <w:sz w:val="20"/>
           <w:szCs w:val="20"/>
         </w:rPr>
@@ -830,7 +877,23 @@
           <w:sz w:val="20"/>
           <w:szCs w:val="20"/>
         </w:rPr>
-        <w:t>FindMyRobo</w:t>
+        <w:t>Find</w:t>
+      </w:r>
+      <w:r>
+        <w:rPr>
+          <w:rFonts w:ascii="Prompt" w:hAnsi="Prompt" w:cs="Prompt"/>
+          <w:sz w:val="20"/>
+          <w:szCs w:val="20"/>
+        </w:rPr>
+        <w:t>m</w:t>
+      </w:r>
+      <w:r>
+        <w:rPr>
+          <w:rFonts w:ascii="Prompt" w:hAnsi="Prompt" w:cs="Prompt"/>
+          <w:sz w:val="20"/>
+          <w:szCs w:val="20"/>
+        </w:rPr>
+        <w:t>yRobo</w:t>
       </w:r>
       <w:proofErr w:type="spellEnd"/>
       <w:r>
@@ -927,7 +990,7 @@
           <w:tab w:val="left" w:pos="2400"/>
         </w:tabs>
         <w:rPr>
-          <w:rFonts w:ascii="Prompt" w:hAnsi="Prompt" w:cs="Prompt" w:hint="cs"/>
+          <w:rFonts w:ascii="Prompt" w:hAnsi="Prompt" w:cs="Prompt"/>
           <w:sz w:val="20"/>
           <w:szCs w:val="20"/>
         </w:rPr>
@@ -942,7 +1005,6 @@
         </w:rPr>
         <w:t>Channels for Return of Product</w:t>
       </w:r>
-      <w:proofErr w:type="gramStart"/>
       <w:r>
         <w:rPr>
           <w:rFonts w:ascii="Prompt" w:hAnsi="Prompt" w:cs="Prompt"/>
@@ -951,9 +1013,8 @@
           <w:sz w:val="20"/>
           <w:szCs w:val="20"/>
         </w:rPr>
-        <w:t>: ?</w:t>
-      </w:r>
-      <w:proofErr w:type="gramEnd"/>
+        <w:br/>
+      </w:r>
       <w:r>
         <w:rPr>
           <w:rFonts w:ascii="Prompt" w:hAnsi="Prompt" w:cs="Prompt"/>
@@ -967,13 +1028,182 @@
       <w:r>
         <w:rPr>
           <w:rFonts w:ascii="Prompt" w:hAnsi="Prompt" w:cs="Prompt"/>
+          <w:sz w:val="20"/>
+          <w:szCs w:val="20"/>
+        </w:rPr>
+        <w:t xml:space="preserve">If the problem occurred upon receiving the product and/or service, please contact Customer Service Center at </w:t>
+      </w:r>
+      <w:r>
+        <w:rPr>
+          <w:rFonts w:ascii="Prompt" w:hAnsi="Prompt" w:cs="Prompt"/>
+          <w:sz w:val="20"/>
+          <w:szCs w:val="20"/>
+        </w:rPr>
+        <w:t>Tel. 02-576-5555</w:t>
+      </w:r>
+      <w:r>
+        <w:rPr>
+          <w:rFonts w:ascii="Prompt" w:hAnsi="Prompt" w:cs="Prompt"/>
+          <w:sz w:val="20"/>
+          <w:szCs w:val="20"/>
+        </w:rPr>
+        <w:t xml:space="preserve">. Upon receiving change-return confirmation for the product and service from </w:t>
+      </w:r>
+      <w:proofErr w:type="spellStart"/>
+      <w:r>
+        <w:rPr>
+          <w:rFonts w:ascii="Prompt" w:hAnsi="Prompt" w:cs="Prompt"/>
+          <w:sz w:val="20"/>
+          <w:szCs w:val="20"/>
+        </w:rPr>
+        <w:t>FindmyRobo</w:t>
+      </w:r>
+      <w:proofErr w:type="spellEnd"/>
+      <w:r>
+        <w:rPr>
+          <w:rFonts w:ascii="Prompt" w:hAnsi="Prompt" w:cs="Prompt"/>
+          <w:sz w:val="20"/>
+          <w:szCs w:val="20"/>
+        </w:rPr>
+        <w:t>, customer can proceed via these channels:</w:t>
+      </w:r>
+      <w:r>
+        <w:rPr>
+          <w:rFonts w:ascii="Prompt" w:hAnsi="Prompt" w:cs="Prompt"/>
+          <w:sz w:val="20"/>
+          <w:szCs w:val="20"/>
+        </w:rPr>
+        <w:br/>
+      </w:r>
+      <w:r>
+        <w:rPr>
+          <w:rFonts w:ascii="Prompt" w:hAnsi="Prompt" w:cs="Prompt"/>
+          <w:sz w:val="20"/>
+          <w:szCs w:val="20"/>
+        </w:rPr>
+        <w:br/>
+        <w:t xml:space="preserve">- Customers are able to return the product to at the following address: 99/40 Software Park Building Moo4, </w:t>
+      </w:r>
+      <w:proofErr w:type="spellStart"/>
+      <w:r>
+        <w:rPr>
+          <w:rFonts w:ascii="Prompt" w:hAnsi="Prompt" w:cs="Prompt"/>
+          <w:sz w:val="20"/>
+          <w:szCs w:val="20"/>
+        </w:rPr>
+        <w:t>Chaengwattana</w:t>
+      </w:r>
+      <w:proofErr w:type="spellEnd"/>
+      <w:r>
+        <w:rPr>
+          <w:rFonts w:ascii="Prompt" w:hAnsi="Prompt" w:cs="Prompt"/>
+          <w:sz w:val="20"/>
+          <w:szCs w:val="20"/>
+        </w:rPr>
+        <w:t xml:space="preserve"> rd., Khlong </w:t>
+      </w:r>
+      <w:proofErr w:type="spellStart"/>
+      <w:r>
+        <w:rPr>
+          <w:rFonts w:ascii="Prompt" w:hAnsi="Prompt" w:cs="Prompt"/>
+          <w:sz w:val="20"/>
+          <w:szCs w:val="20"/>
+        </w:rPr>
+        <w:t>Kluea</w:t>
+      </w:r>
+      <w:proofErr w:type="spellEnd"/>
+      <w:r>
+        <w:rPr>
+          <w:rFonts w:ascii="Prompt" w:hAnsi="Prompt" w:cs="Prompt"/>
+          <w:sz w:val="20"/>
+          <w:szCs w:val="20"/>
+        </w:rPr>
+        <w:t>, Pak Kret, Nonthaburi Thailand 11120.</w:t>
+      </w:r>
+      <w:r>
+        <w:rPr>
+          <w:rFonts w:ascii="Prompt" w:hAnsi="Prompt" w:cs="Prompt"/>
+          <w:sz w:val="20"/>
+          <w:szCs w:val="20"/>
+        </w:rPr>
+        <w:br/>
+      </w:r>
+      <w:r>
+        <w:rPr>
+          <w:rFonts w:ascii="Prompt" w:hAnsi="Prompt" w:cs="Prompt"/>
+          <w:sz w:val="20"/>
+          <w:szCs w:val="20"/>
+        </w:rPr>
+        <w:br/>
+        <w:t xml:space="preserve">- Customers are able to inform </w:t>
+      </w:r>
+      <w:proofErr w:type="spellStart"/>
+      <w:r>
+        <w:rPr>
+          <w:rFonts w:ascii="Prompt" w:hAnsi="Prompt" w:cs="Prompt"/>
+          <w:sz w:val="20"/>
+          <w:szCs w:val="20"/>
+        </w:rPr>
+        <w:t>FindmyRobo</w:t>
+      </w:r>
+      <w:proofErr w:type="spellEnd"/>
+      <w:r>
+        <w:rPr>
+          <w:rFonts w:ascii="Prompt" w:hAnsi="Prompt" w:cs="Prompt"/>
+          <w:sz w:val="20"/>
+          <w:szCs w:val="20"/>
+        </w:rPr>
+        <w:t xml:space="preserve"> staff of the location for on-site product pickup.</w:t>
+      </w:r>
+    </w:p>
+    <w:p>
+      <w:pPr>
+        <w:tabs>
+          <w:tab w:val="left" w:pos="2400"/>
+        </w:tabs>
+        <w:rPr>
+          <w:rFonts w:ascii="Prompt" w:hAnsi="Prompt" w:cs="Prompt"/>
+          <w:sz w:val="20"/>
+          <w:szCs w:val="20"/>
+        </w:rPr>
+      </w:pPr>
+      <w:r>
+        <w:rPr>
+          <w:rFonts w:ascii="Prompt" w:hAnsi="Prompt" w:cs="Prompt"/>
+          <w:sz w:val="20"/>
+          <w:szCs w:val="20"/>
+        </w:rPr>
+        <w:t>*Remark: Customers return the product which has the conditions described above terms of change.</w:t>
+      </w:r>
+    </w:p>
+    <w:p>
+      <w:pPr>
+        <w:tabs>
+          <w:tab w:val="left" w:pos="2400"/>
+        </w:tabs>
+        <w:rPr>
+          <w:rFonts w:ascii="Prompt" w:hAnsi="Prompt" w:cs="Prompt"/>
+          <w:sz w:val="20"/>
+          <w:szCs w:val="20"/>
+        </w:rPr>
+      </w:pPr>
+      <w:r>
+        <w:rPr>
+          <w:rFonts w:ascii="Prompt" w:hAnsi="Prompt" w:cs="Prompt"/>
+          <w:sz w:val="20"/>
+          <w:szCs w:val="20"/>
+        </w:rPr>
+        <w:t>According to the distance of the pickup location from the office, the service fees will be charged.</w:t>
+      </w:r>
+      <w:r>
+        <w:rPr>
+          <w:rFonts w:ascii="Prompt" w:hAnsi="Prompt" w:cs="Prompt"/>
           <w:b/>
           <w:bCs/>
           <w:sz w:val="20"/>
           <w:szCs w:val="20"/>
         </w:rPr>
         <w:br/>
-        <w:t>Terms for the Cancellation of Purchase and Return of Product</w:t>
       </w:r>
       <w:r>
         <w:rPr>
@@ -984,6 +1214,7 @@
           <w:szCs w:val="20"/>
         </w:rPr>
         <w:br/>
+        <w:t>Terms for the Cancellation of Purchase and Return of Product</w:t>
       </w:r>
       <w:r>
         <w:rPr>
@@ -998,18 +1229,21 @@
       <w:r>
         <w:rPr>
           <w:rFonts w:ascii="Prompt" w:hAnsi="Prompt" w:cs="Prompt"/>
-          <w:sz w:val="20"/>
-          <w:szCs w:val="20"/>
-        </w:rPr>
-        <w:t>Customers have the right to cancel a purchase before purchase delivery is scheduled.</w:t>
-      </w:r>
-      <w:r>
-        <w:rPr>
-          <w:rFonts w:ascii="Prompt" w:hAnsi="Prompt" w:cs="Prompt"/>
-          <w:sz w:val="20"/>
-          <w:szCs w:val="20"/>
-        </w:rPr>
-        <w:t xml:space="preserve"> Additionally, if any issues are encountered within 14 days of receiving the product or service under the specified conditions. In all cases, customers must report problems related to order cancellation and product terms through Customer Service Center at Tel. 02-576-5555 or via line on FindMyRobo.com.</w:t>
+          <w:b/>
+          <w:bCs/>
+          <w:sz w:val="20"/>
+          <w:szCs w:val="20"/>
+        </w:rPr>
+        <w:br/>
+      </w:r>
+      <w:r>
+        <w:rPr>
+          <w:rFonts w:ascii="Prompt" w:hAnsi="Prompt" w:cs="Prompt"/>
+          <w:sz w:val="20"/>
+          <w:szCs w:val="20"/>
+        </w:rPr>
+        <w:lastRenderedPageBreak/>
+        <w:t>Customers have the right to cancel a purchase before purchase delivery is scheduled. Additionally, if any issues are encountered within 14 days of receiving the product or service under the specified conditions. In all cases, customers must report problems related to order cancellation and product terms through Customer Service Center at Tel. 02-576-5555 or via line on FindMyRobo.com.</w:t>
       </w:r>
       <w:r>
         <w:rPr>
@@ -1108,41 +1342,45 @@
         <w:br/>
         <w:t xml:space="preserve">5. </w:t>
       </w:r>
-      <w:proofErr w:type="gramStart"/>
-      <w:r>
-        <w:rPr>
-          <w:rFonts w:ascii="Prompt" w:hAnsi="Prompt" w:cs="Prompt"/>
-          <w:sz w:val="20"/>
-          <w:szCs w:val="20"/>
-        </w:rPr>
-        <w:t>Product</w:t>
-      </w:r>
-      <w:proofErr w:type="gramEnd"/>
-      <w:r>
-        <w:rPr>
-          <w:rFonts w:ascii="Prompt" w:hAnsi="Prompt" w:cs="Prompt"/>
-          <w:sz w:val="20"/>
-          <w:szCs w:val="20"/>
-        </w:rPr>
-        <w:t xml:space="preserve"> provided under the condition of promotion must be returned together with the </w:t>
-      </w:r>
-      <w:r>
-        <w:rPr>
-          <w:rFonts w:ascii="Prompt" w:hAnsi="Prompt" w:cs="Prompt"/>
-          <w:sz w:val="20"/>
-          <w:szCs w:val="20"/>
-        </w:rPr>
-        <w:lastRenderedPageBreak/>
-        <w:t>major product.</w:t>
-      </w:r>
-      <w:r>
-        <w:rPr>
-          <w:rFonts w:ascii="Prompt" w:hAnsi="Prompt" w:cs="Prompt"/>
-          <w:sz w:val="20"/>
-          <w:szCs w:val="20"/>
-        </w:rPr>
-        <w:br/>
-        <w:t>6.Expense incurred from the transportation of the returning product, special package, installation and other Service Fee are non-refundable.</w:t>
+      <w:r>
+        <w:rPr>
+          <w:rFonts w:ascii="Prompt" w:hAnsi="Prompt" w:cs="Prompt"/>
+          <w:sz w:val="20"/>
+          <w:szCs w:val="20"/>
+        </w:rPr>
+        <w:t>Products</w:t>
+      </w:r>
+      <w:r>
+        <w:rPr>
+          <w:rFonts w:ascii="Prompt" w:hAnsi="Prompt" w:cs="Prompt"/>
+          <w:sz w:val="20"/>
+          <w:szCs w:val="20"/>
+        </w:rPr>
+        <w:t xml:space="preserve"> provided under the condition of promotion must be returned together with the major product.</w:t>
+      </w:r>
+      <w:r>
+        <w:rPr>
+          <w:rFonts w:ascii="Prompt" w:hAnsi="Prompt" w:cs="Prompt"/>
+          <w:sz w:val="20"/>
+          <w:szCs w:val="20"/>
+        </w:rPr>
+        <w:br/>
+      </w:r>
+      <w:r>
+        <w:rPr>
+          <w:rFonts w:ascii="Prompt" w:hAnsi="Prompt" w:cs="Prompt"/>
+          <w:sz w:val="20"/>
+          <w:szCs w:val="20"/>
+        </w:rPr>
+        <w:t>6. Expense</w:t>
+      </w:r>
+      <w:r>
+        <w:rPr>
+          <w:rFonts w:ascii="Prompt" w:hAnsi="Prompt" w:cs="Prompt"/>
+          <w:sz w:val="20"/>
+          <w:szCs w:val="20"/>
+        </w:rPr>
+        <w:t xml:space="preserve"> incurred from the transportation of the returning product, special package, installation and other Service Fee are non-refundable.</w:t>
       </w:r>
     </w:p>
     <w:sectPr>
@@ -1156,7 +1394,7 @@
 </file>
 
 <file path=word/numbering.xml><?xml version="1.0" encoding="utf-8"?>
-<w:numbering xmlns:wpc="http://schemas.microsoft.com/office/word/2010/wordprocessingCanvas" xmlns:cx="http://schemas.microsoft.com/office/drawing/2014/chartex" xmlns:cx1="http://schemas.microsoft.com/office/drawing/2015/9/8/chartex" xmlns:cx2="http://schemas.microsoft.com/office/drawing/2015/10/21/chartex" xmlns:cx3="http://schemas.microsoft.com/office/drawing/2016/5/9/chartex" xmlns:cx4="http://schemas.microsoft.com/office/drawing/2016/5/10/chartex" xmlns:cx5="http://schemas.microsoft.com/office/drawing/2016/5/11/chartex" xmlns:cx6="http://schemas.microsoft.com/office/drawing/2016/5/12/chartex" xmlns:cx7="http://schemas.microsoft.com/office/drawing/2016/5/13/chartex" xmlns:cx8="http://schemas.microsoft.com/office/drawing/2016/5/14/chartex" xmlns:mc="http://schemas.openxmlformats.org/markup-compatibility/2006" xmlns:aink="http://schemas.microsoft.com/office/drawing/2016/ink" xmlns:am3d="http://schemas.microsoft.com/office/drawing/2017/model3d" xmlns:o="urn:schemas-microsoft-com:office:office" xmlns:oel="http://schemas.microsoft.com/office/2019/extlst" xmlns:r="http://schemas.openxmlformats.org/officeDocument/2006/relationships" xmlns:m="http://schemas.openxmlformats.org/officeDocument/2006/math" xmlns:v="urn:schemas-microsoft-com:vml" xmlns:wp14="http://schemas.microsoft.com/office/word/2010/wordprocessingDrawing" xmlns:wp="http://schemas.openxmlformats.org/drawingml/2006/wordprocessingDrawing" xmlns:w10="urn:schemas-microsoft-com:office:word" xmlns:w="http://schemas.openxmlformats.org/wordprocessingml/2006/main" xmlns:w14="http://schemas.microsoft.com/office/word/2010/wordml" xmlns:w15="http://schemas.microsoft.com/office/word/2012/wordml" xmlns:w16cei="http://schemas.microsoft.com/office/word/2026/wordml/cei" xmlns:w16cex="http://schemas.microsoft.com/office/word/2018/wordml/cex" xmlns:w16cid="http://schemas.microsoft.com/office/word/2016/wordml/cid" xmlns:w16="http://schemas.microsoft.com/office/word/2018/wordml" xmlns:w16du="http://schemas.microsoft.com/office/word/2023/wordml/word16du" xmlns:w16sdtdh="http://schemas.microsoft.com/office/word/2020/wordml/sdtdatahash" xmlns:w16sdtfl="http://schemas.microsoft.com/office/word/2024/wordml/sdtformatlock" xmlns:w16se="http://schemas.microsoft.com/office/word/2015/wordml/symex" xmlns:wpg="http://schemas.microsoft.com/office/word/2010/wordprocessingGroup" xmlns:wpi="http://schemas.microsoft.com/office/word/2010/wordprocessingInk" xmlns:wne="http://schemas.microsoft.com/office/word/2006/wordml" xmlns:wps="http://schemas.microsoft.com/office/word/2010/wordprocessingShape" mc:Ignorable="w14 w15 w16se w16cid w16 w16cex w16sdtdh w16sdtfl w16du wp14">
+<w:numbering xmlns:wpc="http://schemas.microsoft.com/office/word/2010/wordprocessingCanvas" xmlns:cx="http://schemas.microsoft.com/office/drawing/2014/chartex" xmlns:cx1="http://schemas.microsoft.com/office/drawing/2015/9/8/chartex" xmlns:cx2="http://schemas.microsoft.com/office/drawing/2015/10/21/chartex" xmlns:cx3="http://schemas.microsoft.com/office/drawing/2016/5/9/chartex" xmlns:cx4="http://schemas.microsoft.com/office/drawing/2016/5/10/chartex" xmlns:cx5="http://schemas.microsoft.com/office/drawing/2016/5/11/chartex" xmlns:cx6="http://schemas.microsoft.com/office/drawing/2016/5/12/chartex" xmlns:cx7="http://schemas.microsoft.com/office/drawing/2016/5/13/chartex" xmlns:cx8="http://schemas.microsoft.com/office/drawing/2016/5/14/chartex" xmlns:mc="http://schemas.openxmlformats.org/markup-compatibility/2006" xmlns:aink="http://schemas.microsoft.com/office/drawing/2016/ink" xmlns:am3d="http://schemas.microsoft.com/office/drawing/2017/model3d" xmlns:o="urn:schemas-microsoft-com:office:office" xmlns:oel="http://schemas.microsoft.com/office/2019/extlst" xmlns:r="http://schemas.openxmlformats.org/officeDocument/2006/relationships" xmlns:m="http://schemas.openxmlformats.org/officeDocument/2006/math" xmlns:v="urn:schemas-microsoft-com:vml" xmlns:wp14="http://schemas.microsoft.com/office/word/2010/wordprocessingDrawing" xmlns:wp="http://schemas.openxmlformats.org/drawingml/2006/wordprocessingDrawing" xmlns:w10="urn:schemas-microsoft-com:office:word" xmlns:w="http://schemas.openxmlformats.org/wordprocessingml/2006/main" xmlns:w14="http://schemas.microsoft.com/office/word/2010/wordml" xmlns:w15="http://schemas.microsoft.com/office/word/2012/wordml" xmlns:w16cex="http://schemas.microsoft.com/office/word/2018/wordml/cex" xmlns:w16cid="http://schemas.microsoft.com/office/word/2016/wordml/cid" xmlns:w16="http://schemas.microsoft.com/office/word/2018/wordml" xmlns:w16du="http://schemas.microsoft.com/office/word/2023/wordml/word16du" xmlns:w16sdtdh="http://schemas.microsoft.com/office/word/2020/wordml/sdtdatahash" xmlns:w16sdtfl="http://schemas.microsoft.com/office/word/2024/wordml/sdtformatlock" xmlns:w16se="http://schemas.microsoft.com/office/word/2015/wordml/symex" xmlns:wpg="http://schemas.microsoft.com/office/word/2010/wordprocessingGroup" xmlns:wpi="http://schemas.microsoft.com/office/word/2010/wordprocessingInk" xmlns:wne="http://schemas.microsoft.com/office/word/2006/wordml" xmlns:wps="http://schemas.microsoft.com/office/word/2010/wordprocessingShape" mc:Ignorable="w14 w15 w16se w16cid w16 w16cex w16sdtdh w16sdtfl w16du wp14">
   <w:abstractNum w:abstractNumId="0" w15:restartNumberingAfterBreak="0">
     <w:nsid w:val="03016E99"/>
     <w:multiLevelType w:val="multilevel"/>
@@ -1583,6 +1821,118 @@
     </w:lvl>
   </w:abstractNum>
   <w:abstractNum w:abstractNumId="4" w15:restartNumberingAfterBreak="0">
+    <w:nsid w:val="32064860"/>
+    <w:multiLevelType w:val="hybridMultilevel"/>
+    <w:tmpl w:val="D3642DC8"/>
+    <w:lvl w:ilvl="0" w:tplc="F246E69E">
+      <w:numFmt w:val="bullet"/>
+      <w:lvlText w:val=""/>
+      <w:lvlJc w:val="left"/>
+      <w:pPr>
+        <w:ind w:left="720" w:hanging="360"/>
+      </w:pPr>
+      <w:rPr>
+        <w:rFonts w:ascii="Symbol" w:eastAsiaTheme="minorHAnsi" w:hAnsi="Symbol" w:cs="Prompt" w:hint="default"/>
+      </w:rPr>
+    </w:lvl>
+    <w:lvl w:ilvl="1" w:tplc="04090003" w:tentative="1">
+      <w:start w:val="1"/>
+      <w:numFmt w:val="bullet"/>
+      <w:lvlText w:val="o"/>
+      <w:lvlJc w:val="left"/>
+      <w:pPr>
+        <w:ind w:left="1440" w:hanging="360"/>
+      </w:pPr>
+      <w:rPr>
+        <w:rFonts w:ascii="Courier New" w:hAnsi="Courier New" w:cs="Courier New" w:hint="default"/>
+      </w:rPr>
+    </w:lvl>
+    <w:lvl w:ilvl="2" w:tplc="04090005" w:tentative="1">
+      <w:start w:val="1"/>
+      <w:numFmt w:val="bullet"/>
+      <w:lvlText w:val=""/>
+      <w:lvlJc w:val="left"/>
+      <w:pPr>
+        <w:ind w:left="2160" w:hanging="360"/>
+      </w:pPr>
+      <w:rPr>
+        <w:rFonts w:ascii="Wingdings" w:hAnsi="Wingdings" w:hint="default"/>
+      </w:rPr>
+    </w:lvl>
+    <w:lvl w:ilvl="3" w:tplc="04090001" w:tentative="1">
+      <w:start w:val="1"/>
+      <w:numFmt w:val="bullet"/>
+      <w:lvlText w:val=""/>
+      <w:lvlJc w:val="left"/>
+      <w:pPr>
+        <w:ind w:left="2880" w:hanging="360"/>
+      </w:pPr>
+      <w:rPr>
+        <w:rFonts w:ascii="Symbol" w:hAnsi="Symbol" w:hint="default"/>
+      </w:rPr>
+    </w:lvl>
+    <w:lvl w:ilvl="4" w:tplc="04090003" w:tentative="1">
+      <w:start w:val="1"/>
+      <w:numFmt w:val="bullet"/>
+      <w:lvlText w:val="o"/>
+      <w:lvlJc w:val="left"/>
+      <w:pPr>
+        <w:ind w:left="3600" w:hanging="360"/>
+      </w:pPr>
+      <w:rPr>
+        <w:rFonts w:ascii="Courier New" w:hAnsi="Courier New" w:cs="Courier New" w:hint="default"/>
+      </w:rPr>
+    </w:lvl>
+    <w:lvl w:ilvl="5" w:tplc="04090005" w:tentative="1">
+      <w:start w:val="1"/>
+      <w:numFmt w:val="bullet"/>
+      <w:lvlText w:val=""/>
+      <w:lvlJc w:val="left"/>
+      <w:pPr>
+        <w:ind w:left="4320" w:hanging="360"/>
+      </w:pPr>
+      <w:rPr>
+        <w:rFonts w:ascii="Wingdings" w:hAnsi="Wingdings" w:hint="default"/>
+      </w:rPr>
+    </w:lvl>
+    <w:lvl w:ilvl="6" w:tplc="04090001" w:tentative="1">
+      <w:start w:val="1"/>
+      <w:numFmt w:val="bullet"/>
+      <w:lvlText w:val=""/>
+      <w:lvlJc w:val="left"/>
+      <w:pPr>
+        <w:ind w:left="5040" w:hanging="360"/>
+      </w:pPr>
+      <w:rPr>
+        <w:rFonts w:ascii="Symbol" w:hAnsi="Symbol" w:hint="default"/>
+      </w:rPr>
+    </w:lvl>
+    <w:lvl w:ilvl="7" w:tplc="04090003" w:tentative="1">
+      <w:start w:val="1"/>
+      <w:numFmt w:val="bullet"/>
+      <w:lvlText w:val="o"/>
+      <w:lvlJc w:val="left"/>
+      <w:pPr>
+        <w:ind w:left="5760" w:hanging="360"/>
+      </w:pPr>
+      <w:rPr>
+        <w:rFonts w:ascii="Courier New" w:hAnsi="Courier New" w:cs="Courier New" w:hint="default"/>
+      </w:rPr>
+    </w:lvl>
+    <w:lvl w:ilvl="8" w:tplc="04090005" w:tentative="1">
+      <w:start w:val="1"/>
+      <w:numFmt w:val="bullet"/>
+      <w:lvlText w:val=""/>
+      <w:lvlJc w:val="left"/>
+      <w:pPr>
+        <w:ind w:left="6480" w:hanging="360"/>
+      </w:pPr>
+      <w:rPr>
+        <w:rFonts w:ascii="Wingdings" w:hAnsi="Wingdings" w:hint="default"/>
+      </w:rPr>
+    </w:lvl>
+  </w:abstractNum>
+  <w:abstractNum w:abstractNumId="5" w15:restartNumberingAfterBreak="0">
     <w:nsid w:val="43833B7C"/>
     <w:multiLevelType w:val="multilevel"/>
     <w:tmpl w:val="81063920"/>
@@ -1695,7 +2045,7 @@
       </w:pPr>
     </w:lvl>
   </w:abstractNum>
-  <w:abstractNum w:abstractNumId="5" w15:restartNumberingAfterBreak="0">
+  <w:abstractNum w:abstractNumId="6" w15:restartNumberingAfterBreak="0">
     <w:nsid w:val="48CC720A"/>
     <w:multiLevelType w:val="hybridMultilevel"/>
     <w:tmpl w:val="5D447814"/>
@@ -1808,7 +2158,7 @@
       </w:rPr>
     </w:lvl>
   </w:abstractNum>
-  <w:abstractNum w:abstractNumId="6" w15:restartNumberingAfterBreak="0">
+  <w:abstractNum w:abstractNumId="7" w15:restartNumberingAfterBreak="0">
     <w:nsid w:val="694B3465"/>
     <w:multiLevelType w:val="hybridMultilevel"/>
     <w:tmpl w:val="14EAA32E"/>
@@ -1901,10 +2251,10 @@
     <w:abstractNumId w:val="3"/>
   </w:num>
   <w:num w:numId="2" w16cid:durableId="1013192963">
-    <w:abstractNumId w:val="5"/>
+    <w:abstractNumId w:val="6"/>
   </w:num>
   <w:num w:numId="3" w16cid:durableId="1119252797">
-    <w:abstractNumId w:val="6"/>
+    <w:abstractNumId w:val="7"/>
   </w:num>
   <w:num w:numId="4" w16cid:durableId="1382049104">
     <w:abstractNumId w:val="2"/>
@@ -1913,10 +2263,13 @@
     <w:abstractNumId w:val="0"/>
   </w:num>
   <w:num w:numId="6" w16cid:durableId="37052284">
-    <w:abstractNumId w:val="4"/>
+    <w:abstractNumId w:val="5"/>
   </w:num>
   <w:num w:numId="7" w16cid:durableId="658734110">
     <w:abstractNumId w:val="1"/>
+  </w:num>
+  <w:num w:numId="8" w16cid:durableId="1478450918">
+    <w:abstractNumId w:val="4"/>
   </w:num>
 </w:numbering>
 </file>
@@ -2524,6 +2877,7 @@
   <w:style w:type="character" w:default="1" w:styleId="DefaultParagraphFont">
     <w:name w:val="Default Paragraph Font"/>
     <w:uiPriority w:val="1"/>
+    <w:semiHidden/>
     <w:unhideWhenUsed/>
   </w:style>
   <w:style w:type="table" w:default="1" w:styleId="TableNormal">

</xml_diff>